<commit_message>
docs(vdd): add VDD for v0.4
</commit_message>
<xml_diff>
--- a/VDDs/VDD-v0.4.docx
+++ b/VDDs/VDD-v0.4.docx
@@ -19644,6 +19644,42 @@
           </w:p>
         </w:tc>
       </w:tr>
+      <w:tr>
+        <w:tc>
+          <w:tcPr>
+            <w:tcW w:type="dxa" w:w="4538"/>
+          </w:tcPr>
+          <w:p>
+            <w:r>
+              <w:t>Requirements Master List: APCS_Requirements.txt (Candidate 2.1.0-rc.1), including REQ-WMS-001 through REQ-WMS-029.</w:t>
+            </w:r>
+          </w:p>
+        </w:tc>
+        <w:tc>
+          <w:tcPr>
+            <w:tcW w:type="dxa" w:w="1672"/>
+          </w:tcPr>
+          <w:p>
+            <w:r/>
+          </w:p>
+        </w:tc>
+        <w:tc>
+          <w:tcPr>
+            <w:tcW w:type="dxa" w:w="1284"/>
+          </w:tcPr>
+          <w:p>
+            <w:r/>
+          </w:p>
+        </w:tc>
+        <w:tc>
+          <w:tcPr>
+            <w:tcW w:type="dxa" w:w="2372"/>
+          </w:tcPr>
+          <w:p>
+            <w:r/>
+          </w:p>
+        </w:tc>
+      </w:tr>
     </w:tbl>
     <w:p/>
     <w:p>
@@ -19912,6 +19948,42 @@
                 <w:iCs/>
               </w:rPr>
             </w:pPr>
+          </w:p>
+        </w:tc>
+      </w:tr>
+      <w:tr>
+        <w:tc>
+          <w:tcPr>
+            <w:tcW w:type="dxa" w:w="4538"/>
+          </w:tcPr>
+          <w:p>
+            <w:r>
+              <w:t>_Evidence not available in this release bundle._</w:t>
+            </w:r>
+          </w:p>
+        </w:tc>
+        <w:tc>
+          <w:tcPr>
+            <w:tcW w:type="dxa" w:w="1672"/>
+          </w:tcPr>
+          <w:p>
+            <w:r/>
+          </w:p>
+        </w:tc>
+        <w:tc>
+          <w:tcPr>
+            <w:tcW w:type="dxa" w:w="1284"/>
+          </w:tcPr>
+          <w:p>
+            <w:r/>
+          </w:p>
+        </w:tc>
+        <w:tc>
+          <w:tcPr>
+            <w:tcW w:type="dxa" w:w="2372"/>
+          </w:tcPr>
+          <w:p>
+            <w:r/>
           </w:p>
         </w:tc>
       </w:tr>
@@ -20474,6 +20546,222 @@
           </w:p>
         </w:tc>
       </w:tr>
+      <w:tr>
+        <w:tc>
+          <w:tcPr>
+            <w:tcW w:type="dxa" w:w="4538"/>
+          </w:tcPr>
+          <w:p>
+            <w:r>
+              <w:t>Pre-Promotion Test Procedure: APCS_Test_Procedure.txt.</w:t>
+            </w:r>
+          </w:p>
+        </w:tc>
+        <w:tc>
+          <w:tcPr>
+            <w:tcW w:type="dxa" w:w="1672"/>
+          </w:tcPr>
+          <w:p>
+            <w:r/>
+          </w:p>
+        </w:tc>
+        <w:tc>
+          <w:tcPr>
+            <w:tcW w:type="dxa" w:w="1284"/>
+          </w:tcPr>
+          <w:p>
+            <w:r/>
+          </w:p>
+        </w:tc>
+        <w:tc>
+          <w:tcPr>
+            <w:tcW w:type="dxa" w:w="2372"/>
+          </w:tcPr>
+          <w:p>
+            <w:r/>
+          </w:p>
+        </w:tc>
+      </w:tr>
+      <w:tr>
+        <w:tc>
+          <w:tcPr>
+            <w:tcW w:type="dxa" w:w="4538"/>
+          </w:tcPr>
+          <w:p>
+            <w:r>
+              <w:t>Test Results:</w:t>
+            </w:r>
+          </w:p>
+        </w:tc>
+        <w:tc>
+          <w:tcPr>
+            <w:tcW w:type="dxa" w:w="1672"/>
+          </w:tcPr>
+          <w:p>
+            <w:r/>
+          </w:p>
+        </w:tc>
+        <w:tc>
+          <w:tcPr>
+            <w:tcW w:type="dxa" w:w="1284"/>
+          </w:tcPr>
+          <w:p>
+            <w:r/>
+          </w:p>
+        </w:tc>
+        <w:tc>
+          <w:tcPr>
+            <w:tcW w:type="dxa" w:w="2372"/>
+          </w:tcPr>
+          <w:p>
+            <w:r/>
+          </w:p>
+        </w:tc>
+      </w:tr>
+      <w:tr>
+        <w:tc>
+          <w:tcPr>
+            <w:tcW w:type="dxa" w:w="4538"/>
+          </w:tcPr>
+          <w:p>
+            <w:r>
+              <w:t>TC-WMS-001, TC-WMS-002, TC-WMS-004 through TC-WMS-009: PASS.</w:t>
+            </w:r>
+          </w:p>
+        </w:tc>
+        <w:tc>
+          <w:tcPr>
+            <w:tcW w:type="dxa" w:w="1672"/>
+          </w:tcPr>
+          <w:p>
+            <w:r/>
+          </w:p>
+        </w:tc>
+        <w:tc>
+          <w:tcPr>
+            <w:tcW w:type="dxa" w:w="1284"/>
+          </w:tcPr>
+          <w:p>
+            <w:r/>
+          </w:p>
+        </w:tc>
+        <w:tc>
+          <w:tcPr>
+            <w:tcW w:type="dxa" w:w="2372"/>
+          </w:tcPr>
+          <w:p>
+            <w:r/>
+          </w:p>
+        </w:tc>
+      </w:tr>
+      <w:tr>
+        <w:tc>
+          <w:tcPr>
+            <w:tcW w:type="dxa" w:w="4538"/>
+          </w:tcPr>
+          <w:p>
+            <w:r>
+              <w:t>TC-WMS-003 (Vibration model accuracy): PASS (97.2% accuracy).</w:t>
+            </w:r>
+          </w:p>
+        </w:tc>
+        <w:tc>
+          <w:tcPr>
+            <w:tcW w:type="dxa" w:w="1672"/>
+          </w:tcPr>
+          <w:p>
+            <w:r/>
+          </w:p>
+        </w:tc>
+        <w:tc>
+          <w:tcPr>
+            <w:tcW w:type="dxa" w:w="1284"/>
+          </w:tcPr>
+          <w:p>
+            <w:r/>
+          </w:p>
+        </w:tc>
+        <w:tc>
+          <w:tcPr>
+            <w:tcW w:type="dxa" w:w="2372"/>
+          </w:tcPr>
+          <w:p>
+            <w:r/>
+          </w:p>
+        </w:tc>
+      </w:tr>
+      <w:tr>
+        <w:tc>
+          <w:tcPr>
+            <w:tcW w:type="dxa" w:w="4538"/>
+          </w:tcPr>
+          <w:p>
+            <w:r>
+              <w:t>TC-WMS-010, TC-WMS-011: PASS (with soft warnings).</w:t>
+            </w:r>
+          </w:p>
+        </w:tc>
+        <w:tc>
+          <w:tcPr>
+            <w:tcW w:type="dxa" w:w="1672"/>
+          </w:tcPr>
+          <w:p>
+            <w:r/>
+          </w:p>
+        </w:tc>
+        <w:tc>
+          <w:tcPr>
+            <w:tcW w:type="dxa" w:w="1284"/>
+          </w:tcPr>
+          <w:p>
+            <w:r/>
+          </w:p>
+        </w:tc>
+        <w:tc>
+          <w:tcPr>
+            <w:tcW w:type="dxa" w:w="2372"/>
+          </w:tcPr>
+          <w:p>
+            <w:r/>
+          </w:p>
+        </w:tc>
+      </w:tr>
+      <w:tr>
+        <w:tc>
+          <w:tcPr>
+            <w:tcW w:type="dxa" w:w="4538"/>
+          </w:tcPr>
+          <w:p>
+            <w:r>
+              <w:t>TC-WMS-012 (Checksum verification): PASS.</w:t>
+            </w:r>
+          </w:p>
+        </w:tc>
+        <w:tc>
+          <w:tcPr>
+            <w:tcW w:type="dxa" w:w="1672"/>
+          </w:tcPr>
+          <w:p>
+            <w:r/>
+          </w:p>
+        </w:tc>
+        <w:tc>
+          <w:tcPr>
+            <w:tcW w:type="dxa" w:w="1284"/>
+          </w:tcPr>
+          <w:p>
+            <w:r/>
+          </w:p>
+        </w:tc>
+        <w:tc>
+          <w:tcPr>
+            <w:tcW w:type="dxa" w:w="2372"/>
+          </w:tcPr>
+          <w:p>
+            <w:r/>
+          </w:p>
+        </w:tc>
+      </w:tr>
     </w:tbl>
     <w:p>
       <w:bookmarkStart w:id="734" w:name="_Toc305402171"/>
@@ -20780,6 +21068,42 @@
                 <w:iCs/>
               </w:rPr>
             </w:pPr>
+          </w:p>
+        </w:tc>
+      </w:tr>
+      <w:tr>
+        <w:tc>
+          <w:tcPr>
+            <w:tcW w:type="dxa" w:w="4538"/>
+          </w:tcPr>
+          <w:p>
+            <w:r>
+              <w:t>Release Email Thread: APCS_Emails.txt (Safety sign-off by Sofia Bianchi).</w:t>
+            </w:r>
+          </w:p>
+        </w:tc>
+        <w:tc>
+          <w:tcPr>
+            <w:tcW w:type="dxa" w:w="1672"/>
+          </w:tcPr>
+          <w:p>
+            <w:r/>
+          </w:p>
+        </w:tc>
+        <w:tc>
+          <w:tcPr>
+            <w:tcW w:type="dxa" w:w="1284"/>
+          </w:tcPr>
+          <w:p>
+            <w:r/>
+          </w:p>
+        </w:tc>
+        <w:tc>
+          <w:tcPr>
+            <w:tcW w:type="dxa" w:w="2372"/>
+          </w:tcPr>
+          <w:p>
+            <w:r/>
           </w:p>
         </w:tc>
       </w:tr>
@@ -22143,6 +22467,96 @@
           </w:p>
         </w:tc>
       </w:tr>
+      <w:tr>
+        <w:tc>
+          <w:tcPr>
+            <w:tcW w:type="dxa" w:w="1939"/>
+          </w:tcPr>
+          <w:p>
+            <w:r>
+              <w:t>Python Version</w:t>
+            </w:r>
+          </w:p>
+        </w:tc>
+        <w:tc>
+          <w:tcPr>
+            <w:tcW w:type="dxa" w:w="3707"/>
+          </w:tcPr>
+          <w:p>
+            <w:r>
+              <w:t>3.11</w:t>
+            </w:r>
+          </w:p>
+        </w:tc>
+        <w:tc>
+          <w:tcPr>
+            <w:tcW w:type="dxa" w:w="4091"/>
+          </w:tcPr>
+          <w:p>
+            <w:r/>
+          </w:p>
+        </w:tc>
+      </w:tr>
+      <w:tr>
+        <w:tc>
+          <w:tcPr>
+            <w:tcW w:type="dxa" w:w="1939"/>
+          </w:tcPr>
+          <w:p>
+            <w:r>
+              <w:t>Dependencies</w:t>
+            </w:r>
+          </w:p>
+        </w:tc>
+        <w:tc>
+          <w:tcPr>
+            <w:tcW w:type="dxa" w:w="3707"/>
+          </w:tcPr>
+          <w:p>
+            <w:r>
+              <w:t>`pydantic`, `python-docx`</w:t>
+            </w:r>
+          </w:p>
+        </w:tc>
+        <w:tc>
+          <w:tcPr>
+            <w:tcW w:type="dxa" w:w="4091"/>
+          </w:tcPr>
+          <w:p>
+            <w:r/>
+          </w:p>
+        </w:tc>
+      </w:tr>
+      <w:tr>
+        <w:tc>
+          <w:tcPr>
+            <w:tcW w:type="dxa" w:w="1939"/>
+          </w:tcPr>
+          <w:p>
+            <w:r>
+              <w:t>CI Pipeline</w:t>
+            </w:r>
+          </w:p>
+        </w:tc>
+        <w:tc>
+          <w:tcPr>
+            <w:tcW w:type="dxa" w:w="3707"/>
+          </w:tcPr>
+          <w:p>
+            <w:r>
+              <w:t>GitHub Actions (as defined in `.github/workflows/`)</w:t>
+            </w:r>
+          </w:p>
+        </w:tc>
+        <w:tc>
+          <w:tcPr>
+            <w:tcW w:type="dxa" w:w="4091"/>
+          </w:tcPr>
+          <w:p>
+            <w:r/>
+          </w:p>
+        </w:tc>
+      </w:tr>
     </w:tbl>
     <w:p>
       <w:pPr>
@@ -24301,6 +24715,998 @@
           </w:p>
         </w:tc>
       </w:tr>
+      <w:tr>
+        <w:tc>
+          <w:tcPr>
+            <w:tcW w:type="dxa" w:w="2020"/>
+          </w:tcPr>
+          <w:p>
+            <w:r>
+              <w:t>1</w:t>
+            </w:r>
+          </w:p>
+        </w:tc>
+        <w:tc>
+          <w:tcPr>
+            <w:tcW w:type="dxa" w:w="1852"/>
+          </w:tcPr>
+          <w:p>
+            <w:r>
+              <w:t>anomaly-engine (2.0.1 → 2.1.0-rc.1):</w:t>
+            </w:r>
+          </w:p>
+        </w:tc>
+        <w:tc>
+          <w:tcPr>
+            <w:tcW w:type="dxa" w:w="2189"/>
+          </w:tcPr>
+          <w:p>
+            <w:r>
+              <w:t>Closed</w:t>
+            </w:r>
+          </w:p>
+        </w:tc>
+        <w:tc>
+          <w:tcPr>
+            <w:tcW w:type="dxa" w:w="2862"/>
+          </w:tcPr>
+          <w:p>
+            <w:r>
+              <w:t>Verdict</w:t>
+            </w:r>
+          </w:p>
+        </w:tc>
+        <w:tc>
+          <w:tcPr>
+            <w:tcW w:type="dxa" w:w="3546"/>
+          </w:tcPr>
+          <w:p>
+            <w:r>
+              <w:t>Change</w:t>
+            </w:r>
+          </w:p>
+        </w:tc>
+        <w:tc>
+          <w:tcPr>
+            <w:tcW w:type="dxa" w:w="1840"/>
+          </w:tcPr>
+          <w:p>
+            <w:r>
+              <w:t>No</w:t>
+            </w:r>
+          </w:p>
+        </w:tc>
+      </w:tr>
+      <w:tr>
+        <w:tc>
+          <w:tcPr>
+            <w:tcW w:type="dxa" w:w="2020"/>
+          </w:tcPr>
+          <w:p>
+            <w:r>
+              <w:t>2</w:t>
+            </w:r>
+          </w:p>
+        </w:tc>
+        <w:tc>
+          <w:tcPr>
+            <w:tcW w:type="dxa" w:w="1852"/>
+          </w:tcPr>
+          <w:p>
+            <w:r>
+              <w:t>Implementation of 3-class statistical model (NOMINAL/DEGRADED/CRITICAL) per REQ-WMS-008.</w:t>
+            </w:r>
+          </w:p>
+        </w:tc>
+        <w:tc>
+          <w:tcPr>
+            <w:tcW w:type="dxa" w:w="2189"/>
+          </w:tcPr>
+          <w:p>
+            <w:r>
+              <w:t>Closed</w:t>
+            </w:r>
+          </w:p>
+        </w:tc>
+        <w:tc>
+          <w:tcPr>
+            <w:tcW w:type="dxa" w:w="2862"/>
+          </w:tcPr>
+          <w:p>
+            <w:r>
+              <w:t>Verdict</w:t>
+            </w:r>
+          </w:p>
+        </w:tc>
+        <w:tc>
+          <w:tcPr>
+            <w:tcW w:type="dxa" w:w="3546"/>
+          </w:tcPr>
+          <w:p>
+            <w:r>
+              <w:t>Change</w:t>
+            </w:r>
+          </w:p>
+        </w:tc>
+        <w:tc>
+          <w:tcPr>
+            <w:tcW w:type="dxa" w:w="1840"/>
+          </w:tcPr>
+          <w:p>
+            <w:r>
+              <w:t>No</w:t>
+            </w:r>
+          </w:p>
+        </w:tc>
+      </w:tr>
+      <w:tr>
+        <w:tc>
+          <w:tcPr>
+            <w:tcW w:type="dxa" w:w="2020"/>
+          </w:tcPr>
+          <w:p>
+            <w:r>
+              <w:t>3</w:t>
+            </w:r>
+          </w:p>
+        </w:tc>
+        <w:tc>
+          <w:tcPr>
+            <w:tcW w:type="dxa" w:w="1852"/>
+          </w:tcPr>
+          <w:p>
+            <w:r>
+              <w:t>Addition of optional `confidence` field to output events per REQ-WMS-010.</w:t>
+            </w:r>
+          </w:p>
+        </w:tc>
+        <w:tc>
+          <w:tcPr>
+            <w:tcW w:type="dxa" w:w="2189"/>
+          </w:tcPr>
+          <w:p>
+            <w:r>
+              <w:t>Closed</w:t>
+            </w:r>
+          </w:p>
+        </w:tc>
+        <w:tc>
+          <w:tcPr>
+            <w:tcW w:type="dxa" w:w="2862"/>
+          </w:tcPr>
+          <w:p>
+            <w:r>
+              <w:t>Verdict</w:t>
+            </w:r>
+          </w:p>
+        </w:tc>
+        <w:tc>
+          <w:tcPr>
+            <w:tcW w:type="dxa" w:w="3546"/>
+          </w:tcPr>
+          <w:p>
+            <w:r>
+              <w:t>Change</w:t>
+            </w:r>
+          </w:p>
+        </w:tc>
+        <w:tc>
+          <w:tcPr>
+            <w:tcW w:type="dxa" w:w="1840"/>
+          </w:tcPr>
+          <w:p>
+            <w:r>
+              <w:t>No</w:t>
+            </w:r>
+          </w:p>
+        </w:tc>
+      </w:tr>
+      <w:tr>
+        <w:tc>
+          <w:tcPr>
+            <w:tcW w:type="dxa" w:w="2020"/>
+          </w:tcPr>
+          <w:p>
+            <w:r>
+              <w:t>4</w:t>
+            </w:r>
+          </w:p>
+        </w:tc>
+        <w:tc>
+          <w:tcPr>
+            <w:tcW w:type="dxa" w:w="1852"/>
+          </w:tcPr>
+          <w:p>
+            <w:r>
+              <w:t>Integration of `vibration_model_v2.pkl`.</w:t>
+            </w:r>
+          </w:p>
+        </w:tc>
+        <w:tc>
+          <w:tcPr>
+            <w:tcW w:type="dxa" w:w="2189"/>
+          </w:tcPr>
+          <w:p>
+            <w:r>
+              <w:t>Closed</w:t>
+            </w:r>
+          </w:p>
+        </w:tc>
+        <w:tc>
+          <w:tcPr>
+            <w:tcW w:type="dxa" w:w="2862"/>
+          </w:tcPr>
+          <w:p>
+            <w:r>
+              <w:t>Verdict</w:t>
+            </w:r>
+          </w:p>
+        </w:tc>
+        <w:tc>
+          <w:tcPr>
+            <w:tcW w:type="dxa" w:w="3546"/>
+          </w:tcPr>
+          <w:p>
+            <w:r>
+              <w:t>Change</w:t>
+            </w:r>
+          </w:p>
+        </w:tc>
+        <w:tc>
+          <w:tcPr>
+            <w:tcW w:type="dxa" w:w="1840"/>
+          </w:tcPr>
+          <w:p>
+            <w:r>
+              <w:t>No</w:t>
+            </w:r>
+          </w:p>
+        </w:tc>
+      </w:tr>
+      <w:tr>
+        <w:tc>
+          <w:tcPr>
+            <w:tcW w:type="dxa" w:w="2020"/>
+          </w:tcPr>
+          <w:p>
+            <w:r>
+              <w:t>5</w:t>
+            </w:r>
+          </w:p>
+        </w:tc>
+        <w:tc>
+          <w:tcPr>
+            <w:tcW w:type="dxa" w:w="1852"/>
+          </w:tcPr>
+          <w:p>
+            <w:r>
+              <w:t>alert-dispatcher (1.1.3 → 1.2.0-rc.1):</w:t>
+            </w:r>
+          </w:p>
+        </w:tc>
+        <w:tc>
+          <w:tcPr>
+            <w:tcW w:type="dxa" w:w="2189"/>
+          </w:tcPr>
+          <w:p>
+            <w:r>
+              <w:t>Closed</w:t>
+            </w:r>
+          </w:p>
+        </w:tc>
+        <w:tc>
+          <w:tcPr>
+            <w:tcW w:type="dxa" w:w="2862"/>
+          </w:tcPr>
+          <w:p>
+            <w:r>
+              <w:t>Verdict</w:t>
+            </w:r>
+          </w:p>
+        </w:tc>
+        <w:tc>
+          <w:tcPr>
+            <w:tcW w:type="dxa" w:w="3546"/>
+          </w:tcPr>
+          <w:p>
+            <w:r>
+              <w:t>Change</w:t>
+            </w:r>
+          </w:p>
+        </w:tc>
+        <w:tc>
+          <w:tcPr>
+            <w:tcW w:type="dxa" w:w="1840"/>
+          </w:tcPr>
+          <w:p>
+            <w:r>
+              <w:t>No</w:t>
+            </w:r>
+          </w:p>
+        </w:tc>
+      </w:tr>
+      <w:tr>
+        <w:tc>
+          <w:tcPr>
+            <w:tcW w:type="dxa" w:w="2020"/>
+          </w:tcPr>
+          <w:p>
+            <w:r>
+              <w:t>6</w:t>
+            </w:r>
+          </w:p>
+        </w:tc>
+        <w:tc>
+          <w:tcPr>
+            <w:tcW w:type="dxa" w:w="1852"/>
+          </w:tcPr>
+          <w:p>
+            <w:r>
+              <w:t>Payload schema update (v1.0 → v1.1) to support DEGRADED severity per REQ-WMS-013.</w:t>
+            </w:r>
+          </w:p>
+        </w:tc>
+        <w:tc>
+          <w:tcPr>
+            <w:tcW w:type="dxa" w:w="2189"/>
+          </w:tcPr>
+          <w:p>
+            <w:r>
+              <w:t>Closed</w:t>
+            </w:r>
+          </w:p>
+        </w:tc>
+        <w:tc>
+          <w:tcPr>
+            <w:tcW w:type="dxa" w:w="2862"/>
+          </w:tcPr>
+          <w:p>
+            <w:r>
+              <w:t>Verdict</w:t>
+            </w:r>
+          </w:p>
+        </w:tc>
+        <w:tc>
+          <w:tcPr>
+            <w:tcW w:type="dxa" w:w="3546"/>
+          </w:tcPr>
+          <w:p>
+            <w:r>
+              <w:t>Change</w:t>
+            </w:r>
+          </w:p>
+        </w:tc>
+        <w:tc>
+          <w:tcPr>
+            <w:tcW w:type="dxa" w:w="1840"/>
+          </w:tcPr>
+          <w:p>
+            <w:r>
+              <w:t>No</w:t>
+            </w:r>
+          </w:p>
+        </w:tc>
+      </w:tr>
+      <w:tr>
+        <w:tc>
+          <w:tcPr>
+            <w:tcW w:type="dxa" w:w="2020"/>
+          </w:tcPr>
+          <w:p>
+            <w:r>
+              <w:t>7</w:t>
+            </w:r>
+          </w:p>
+        </w:tc>
+        <w:tc>
+          <w:tcPr>
+            <w:tcW w:type="dxa" w:w="1852"/>
+          </w:tcPr>
+          <w:p>
+            <w:r>
+              <w:t>New routing for DEGRADED alerts to "monitor" endpoint group.</w:t>
+            </w:r>
+          </w:p>
+        </w:tc>
+        <w:tc>
+          <w:tcPr>
+            <w:tcW w:type="dxa" w:w="2189"/>
+          </w:tcPr>
+          <w:p>
+            <w:r>
+              <w:t>Closed</w:t>
+            </w:r>
+          </w:p>
+        </w:tc>
+        <w:tc>
+          <w:tcPr>
+            <w:tcW w:type="dxa" w:w="2862"/>
+          </w:tcPr>
+          <w:p>
+            <w:r>
+              <w:t>Verdict</w:t>
+            </w:r>
+          </w:p>
+        </w:tc>
+        <w:tc>
+          <w:tcPr>
+            <w:tcW w:type="dxa" w:w="3546"/>
+          </w:tcPr>
+          <w:p>
+            <w:r>
+              <w:t>Change</w:t>
+            </w:r>
+          </w:p>
+        </w:tc>
+        <w:tc>
+          <w:tcPr>
+            <w:tcW w:type="dxa" w:w="1840"/>
+          </w:tcPr>
+          <w:p>
+            <w:r>
+              <w:t>No</w:t>
+            </w:r>
+          </w:p>
+        </w:tc>
+      </w:tr>
+      <w:tr>
+        <w:tc>
+          <w:tcPr>
+            <w:tcW w:type="dxa" w:w="2020"/>
+          </w:tcPr>
+          <w:p>
+            <w:r>
+              <w:t>8</w:t>
+            </w:r>
+          </w:p>
+        </w:tc>
+        <w:tc>
+          <w:tcPr>
+            <w:tcW w:type="dxa" w:w="1852"/>
+          </w:tcPr>
+          <w:p>
+            <w:r>
+              <w:t>Addition of `model_ver` field for traceability per REQ-WMS-011.</w:t>
+            </w:r>
+          </w:p>
+        </w:tc>
+        <w:tc>
+          <w:tcPr>
+            <w:tcW w:type="dxa" w:w="2189"/>
+          </w:tcPr>
+          <w:p>
+            <w:r>
+              <w:t>Closed</w:t>
+            </w:r>
+          </w:p>
+        </w:tc>
+        <w:tc>
+          <w:tcPr>
+            <w:tcW w:type="dxa" w:w="2862"/>
+          </w:tcPr>
+          <w:p>
+            <w:r>
+              <w:t>Verdict</w:t>
+            </w:r>
+          </w:p>
+        </w:tc>
+        <w:tc>
+          <w:tcPr>
+            <w:tcW w:type="dxa" w:w="3546"/>
+          </w:tcPr>
+          <w:p>
+            <w:r>
+              <w:t>Change</w:t>
+            </w:r>
+          </w:p>
+        </w:tc>
+        <w:tc>
+          <w:tcPr>
+            <w:tcW w:type="dxa" w:w="1840"/>
+          </w:tcPr>
+          <w:p>
+            <w:r>
+              <w:t>No</w:t>
+            </w:r>
+          </w:p>
+        </w:tc>
+      </w:tr>
+      <w:tr>
+        <w:tc>
+          <w:tcPr>
+            <w:tcW w:type="dxa" w:w="2020"/>
+          </w:tcPr>
+          <w:p>
+            <w:r>
+              <w:t>9</w:t>
+            </w:r>
+          </w:p>
+        </w:tc>
+        <w:tc>
+          <w:tcPr>
+            <w:tcW w:type="dxa" w:w="1852"/>
+          </w:tcPr>
+          <w:p>
+            <w:r>
+              <w:t>CRITICAL alert deduplication within 30-second window per REQ-WMS-026.</w:t>
+            </w:r>
+          </w:p>
+        </w:tc>
+        <w:tc>
+          <w:tcPr>
+            <w:tcW w:type="dxa" w:w="2189"/>
+          </w:tcPr>
+          <w:p>
+            <w:r>
+              <w:t>Closed</w:t>
+            </w:r>
+          </w:p>
+        </w:tc>
+        <w:tc>
+          <w:tcPr>
+            <w:tcW w:type="dxa" w:w="2862"/>
+          </w:tcPr>
+          <w:p>
+            <w:r>
+              <w:t>Verdict</w:t>
+            </w:r>
+          </w:p>
+        </w:tc>
+        <w:tc>
+          <w:tcPr>
+            <w:tcW w:type="dxa" w:w="3546"/>
+          </w:tcPr>
+          <w:p>
+            <w:r>
+              <w:t>Change</w:t>
+            </w:r>
+          </w:p>
+        </w:tc>
+        <w:tc>
+          <w:tcPr>
+            <w:tcW w:type="dxa" w:w="1840"/>
+          </w:tcPr>
+          <w:p>
+            <w:r>
+              <w:t>No</w:t>
+            </w:r>
+          </w:p>
+        </w:tc>
+      </w:tr>
+      <w:tr>
+        <w:tc>
+          <w:tcPr>
+            <w:tcW w:type="dxa" w:w="2020"/>
+          </w:tcPr>
+          <w:p>
+            <w:r>
+              <w:t>10</w:t>
+            </w:r>
+          </w:p>
+        </w:tc>
+        <w:tc>
+          <w:tcPr>
+            <w:tcW w:type="dxa" w:w="1852"/>
+          </w:tcPr>
+          <w:p>
+            <w:r>
+              <w:t>Statistics endpoint exposing dispatched, suppressed, dead_lettered counters per REQ-WMS-027.</w:t>
+            </w:r>
+          </w:p>
+        </w:tc>
+        <w:tc>
+          <w:tcPr>
+            <w:tcW w:type="dxa" w:w="2189"/>
+          </w:tcPr>
+          <w:p>
+            <w:r>
+              <w:t>Closed</w:t>
+            </w:r>
+          </w:p>
+        </w:tc>
+        <w:tc>
+          <w:tcPr>
+            <w:tcW w:type="dxa" w:w="2862"/>
+          </w:tcPr>
+          <w:p>
+            <w:r>
+              <w:t>Verdict</w:t>
+            </w:r>
+          </w:p>
+        </w:tc>
+        <w:tc>
+          <w:tcPr>
+            <w:tcW w:type="dxa" w:w="3546"/>
+          </w:tcPr>
+          <w:p>
+            <w:r>
+              <w:t>Change</w:t>
+            </w:r>
+          </w:p>
+        </w:tc>
+        <w:tc>
+          <w:tcPr>
+            <w:tcW w:type="dxa" w:w="1840"/>
+          </w:tcPr>
+          <w:p>
+            <w:r>
+              <w:t>No</w:t>
+            </w:r>
+          </w:p>
+        </w:tc>
+      </w:tr>
+      <w:tr>
+        <w:tc>
+          <w:tcPr>
+            <w:tcW w:type="dxa" w:w="2020"/>
+          </w:tcPr>
+          <w:p>
+            <w:r>
+              <w:t>11</w:t>
+            </w:r>
+          </w:p>
+        </w:tc>
+        <w:tc>
+          <w:tcPr>
+            <w:tcW w:type="dxa" w:w="1852"/>
+          </w:tcPr>
+          <w:p>
+            <w:r>
+              <w:t>sensor-collector (1.2.0 → 1.3.0):</w:t>
+            </w:r>
+          </w:p>
+        </w:tc>
+        <w:tc>
+          <w:tcPr>
+            <w:tcW w:type="dxa" w:w="2189"/>
+          </w:tcPr>
+          <w:p>
+            <w:r>
+              <w:t>Closed</w:t>
+            </w:r>
+          </w:p>
+        </w:tc>
+        <w:tc>
+          <w:tcPr>
+            <w:tcW w:type="dxa" w:w="2862"/>
+          </w:tcPr>
+          <w:p>
+            <w:r>
+              <w:t>Verdict</w:t>
+            </w:r>
+          </w:p>
+        </w:tc>
+        <w:tc>
+          <w:tcPr>
+            <w:tcW w:type="dxa" w:w="3546"/>
+          </w:tcPr>
+          <w:p>
+            <w:r>
+              <w:t>Change</w:t>
+            </w:r>
+          </w:p>
+        </w:tc>
+        <w:tc>
+          <w:tcPr>
+            <w:tcW w:type="dxa" w:w="1840"/>
+          </w:tcPr>
+          <w:p>
+            <w:r>
+              <w:t>No</w:t>
+            </w:r>
+          </w:p>
+        </w:tc>
+      </w:tr>
+      <w:tr>
+        <w:tc>
+          <w:tcPr>
+            <w:tcW w:type="dxa" w:w="2020"/>
+          </w:tcPr>
+          <w:p>
+            <w:r>
+              <w:t>12</w:t>
+            </w:r>
+          </w:p>
+        </w:tc>
+        <w:tc>
+          <w:tcPr>
+            <w:tcW w:type="dxa" w:w="1852"/>
+          </w:tcPr>
+          <w:p>
+            <w:r>
+              <w:t>Monotonic sequence number (`seq`) field on SensorReading events per REQ-WMS-028.</w:t>
+            </w:r>
+          </w:p>
+        </w:tc>
+        <w:tc>
+          <w:tcPr>
+            <w:tcW w:type="dxa" w:w="2189"/>
+          </w:tcPr>
+          <w:p>
+            <w:r>
+              <w:t>Closed</w:t>
+            </w:r>
+          </w:p>
+        </w:tc>
+        <w:tc>
+          <w:tcPr>
+            <w:tcW w:type="dxa" w:w="2862"/>
+          </w:tcPr>
+          <w:p>
+            <w:r>
+              <w:t>Verdict</w:t>
+            </w:r>
+          </w:p>
+        </w:tc>
+        <w:tc>
+          <w:tcPr>
+            <w:tcW w:type="dxa" w:w="3546"/>
+          </w:tcPr>
+          <w:p>
+            <w:r>
+              <w:t>Change</w:t>
+            </w:r>
+          </w:p>
+        </w:tc>
+        <w:tc>
+          <w:tcPr>
+            <w:tcW w:type="dxa" w:w="1840"/>
+          </w:tcPr>
+          <w:p>
+            <w:r>
+              <w:t>No</w:t>
+            </w:r>
+          </w:p>
+        </w:tc>
+      </w:tr>
+      <w:tr>
+        <w:tc>
+          <w:tcPr>
+            <w:tcW w:type="dxa" w:w="2020"/>
+          </w:tcPr>
+          <w:p>
+            <w:r>
+              <w:t>13</w:t>
+            </w:r>
+          </w:p>
+        </w:tc>
+        <w:tc>
+          <w:tcPr>
+            <w:tcW w:type="dxa" w:w="1852"/>
+          </w:tcPr>
+          <w:p>
+            <w:r>
+              <w:t>Sensor silence detection with DEGRADED health alert per REQ-WMS-029.</w:t>
+            </w:r>
+          </w:p>
+        </w:tc>
+        <w:tc>
+          <w:tcPr>
+            <w:tcW w:type="dxa" w:w="2189"/>
+          </w:tcPr>
+          <w:p>
+            <w:r>
+              <w:t>Closed</w:t>
+            </w:r>
+          </w:p>
+        </w:tc>
+        <w:tc>
+          <w:tcPr>
+            <w:tcW w:type="dxa" w:w="2862"/>
+          </w:tcPr>
+          <w:p>
+            <w:r>
+              <w:t>Verdict</w:t>
+            </w:r>
+          </w:p>
+        </w:tc>
+        <w:tc>
+          <w:tcPr>
+            <w:tcW w:type="dxa" w:w="3546"/>
+          </w:tcPr>
+          <w:p>
+            <w:r>
+              <w:t>Change</w:t>
+            </w:r>
+          </w:p>
+        </w:tc>
+        <w:tc>
+          <w:tcPr>
+            <w:tcW w:type="dxa" w:w="1840"/>
+          </w:tcPr>
+          <w:p>
+            <w:r>
+              <w:t>No</w:t>
+            </w:r>
+          </w:p>
+        </w:tc>
+      </w:tr>
+      <w:tr>
+        <w:tc>
+          <w:tcPr>
+            <w:tcW w:type="dxa" w:w="2020"/>
+          </w:tcPr>
+          <w:p>
+            <w:r>
+              <w:t>14</w:t>
+            </w:r>
+          </w:p>
+        </w:tc>
+        <w:tc>
+          <w:tcPr>
+            <w:tcW w:type="dxa" w:w="1852"/>
+          </w:tcPr>
+          <w:p>
+            <w:r>
+              <w:t>Infrastructure:</w:t>
+            </w:r>
+          </w:p>
+        </w:tc>
+        <w:tc>
+          <w:tcPr>
+            <w:tcW w:type="dxa" w:w="2189"/>
+          </w:tcPr>
+          <w:p>
+            <w:r>
+              <w:t>Closed</w:t>
+            </w:r>
+          </w:p>
+        </w:tc>
+        <w:tc>
+          <w:tcPr>
+            <w:tcW w:type="dxa" w:w="2862"/>
+          </w:tcPr>
+          <w:p>
+            <w:r>
+              <w:t>Verdict</w:t>
+            </w:r>
+          </w:p>
+        </w:tc>
+        <w:tc>
+          <w:tcPr>
+            <w:tcW w:type="dxa" w:w="3546"/>
+          </w:tcPr>
+          <w:p>
+            <w:r>
+              <w:t>Change</w:t>
+            </w:r>
+          </w:p>
+        </w:tc>
+        <w:tc>
+          <w:tcPr>
+            <w:tcW w:type="dxa" w:w="1840"/>
+          </w:tcPr>
+          <w:p>
+            <w:r>
+              <w:t>No</w:t>
+            </w:r>
+          </w:p>
+        </w:tc>
+      </w:tr>
+      <w:tr>
+        <w:tc>
+          <w:tcPr>
+            <w:tcW w:type="dxa" w:w="2020"/>
+          </w:tcPr>
+          <w:p>
+            <w:r>
+              <w:t>15</w:t>
+            </w:r>
+          </w:p>
+        </w:tc>
+        <w:tc>
+          <w:tcPr>
+            <w:tcW w:type="dxa" w:w="1852"/>
+          </w:tcPr>
+          <w:p>
+            <w:r>
+              <w:t>`ci.yml` (1.0.1 → 1.0.2): Added model artefact checksum verification (TC-WMS-012).</w:t>
+            </w:r>
+          </w:p>
+        </w:tc>
+        <w:tc>
+          <w:tcPr>
+            <w:tcW w:type="dxa" w:w="2189"/>
+          </w:tcPr>
+          <w:p>
+            <w:r>
+              <w:t>Closed</w:t>
+            </w:r>
+          </w:p>
+        </w:tc>
+        <w:tc>
+          <w:tcPr>
+            <w:tcW w:type="dxa" w:w="2862"/>
+          </w:tcPr>
+          <w:p>
+            <w:r>
+              <w:t>Verdict</w:t>
+            </w:r>
+          </w:p>
+        </w:tc>
+        <w:tc>
+          <w:tcPr>
+            <w:tcW w:type="dxa" w:w="3546"/>
+          </w:tcPr>
+          <w:p>
+            <w:r>
+              <w:t>Change</w:t>
+            </w:r>
+          </w:p>
+        </w:tc>
+        <w:tc>
+          <w:tcPr>
+            <w:tcW w:type="dxa" w:w="1840"/>
+          </w:tcPr>
+          <w:p>
+            <w:r>
+              <w:t>No</w:t>
+            </w:r>
+          </w:p>
+        </w:tc>
+      </w:tr>
+      <w:tr>
+        <w:tc>
+          <w:tcPr>
+            <w:tcW w:type="dxa" w:w="2020"/>
+          </w:tcPr>
+          <w:p>
+            <w:r>
+              <w:t>16</w:t>
+            </w:r>
+          </w:p>
+        </w:tc>
+        <w:tc>
+          <w:tcPr>
+            <w:tcW w:type="dxa" w:w="1852"/>
+          </w:tcPr>
+          <w:p>
+            <w:r>
+              <w:t>`wms-chart` (0.2.2 → 0.3.0): Added `anomalyEngine.modelVersion` environment variable.</w:t>
+            </w:r>
+          </w:p>
+        </w:tc>
+        <w:tc>
+          <w:tcPr>
+            <w:tcW w:type="dxa" w:w="2189"/>
+          </w:tcPr>
+          <w:p>
+            <w:r>
+              <w:t>Closed</w:t>
+            </w:r>
+          </w:p>
+        </w:tc>
+        <w:tc>
+          <w:tcPr>
+            <w:tcW w:type="dxa" w:w="2862"/>
+          </w:tcPr>
+          <w:p>
+            <w:r>
+              <w:t>Verdict</w:t>
+            </w:r>
+          </w:p>
+        </w:tc>
+        <w:tc>
+          <w:tcPr>
+            <w:tcW w:type="dxa" w:w="3546"/>
+          </w:tcPr>
+          <w:p>
+            <w:r>
+              <w:t>Change</w:t>
+            </w:r>
+          </w:p>
+        </w:tc>
+        <w:tc>
+          <w:tcPr>
+            <w:tcW w:type="dxa" w:w="1840"/>
+          </w:tcPr>
+          <w:p>
+            <w:r>
+              <w:t>No</w:t>
+            </w:r>
+          </w:p>
+        </w:tc>
+      </w:tr>
     </w:tbl>
     <w:p/>
     <w:p>
@@ -26341,6 +27747,214 @@
           </w:p>
         </w:tc>
       </w:tr>
+      <w:tr>
+        <w:tc>
+          <w:tcPr>
+            <w:tcW w:type="dxa" w:w="1847"/>
+          </w:tcPr>
+          <w:p>
+            <w:r>
+              <w:t>1</w:t>
+            </w:r>
+          </w:p>
+        </w:tc>
+        <w:tc>
+          <w:tcPr>
+            <w:tcW w:type="dxa" w:w="2617"/>
+          </w:tcPr>
+          <w:p>
+            <w:r>
+              <w:t>Migration of `sensor-collector` to async I/O (planned for v1.4.0).</w:t>
+            </w:r>
+          </w:p>
+        </w:tc>
+        <w:tc>
+          <w:tcPr>
+            <w:tcW w:type="dxa" w:w="2462"/>
+          </w:tcPr>
+          <w:p>
+            <w:r>
+              <w:t>Verdict</w:t>
+            </w:r>
+          </w:p>
+        </w:tc>
+        <w:tc>
+          <w:tcPr>
+            <w:tcW w:type="dxa" w:w="5543"/>
+          </w:tcPr>
+          <w:p>
+            <w:r>
+              <w:t>Change</w:t>
+            </w:r>
+          </w:p>
+        </w:tc>
+        <w:tc>
+          <w:tcPr>
+            <w:tcW w:type="dxa" w:w="1840"/>
+          </w:tcPr>
+          <w:p>
+            <w:r>
+              <w:t>No</w:t>
+            </w:r>
+          </w:p>
+        </w:tc>
+      </w:tr>
+      <w:tr>
+        <w:tc>
+          <w:tcPr>
+            <w:tcW w:type="dxa" w:w="1847"/>
+          </w:tcPr>
+          <w:p>
+            <w:r>
+              <w:t>2</w:t>
+            </w:r>
+          </w:p>
+        </w:tc>
+        <w:tc>
+          <w:tcPr>
+            <w:tcW w:type="dxa" w:w="2617"/>
+          </w:tcPr>
+          <w:p>
+            <w:r>
+              <w:t>DEGRADED alert batching (REQ-WMS-017, deferred to `alert-dispatcher` v1.3.0).</w:t>
+            </w:r>
+          </w:p>
+        </w:tc>
+        <w:tc>
+          <w:tcPr>
+            <w:tcW w:type="dxa" w:w="2462"/>
+          </w:tcPr>
+          <w:p>
+            <w:r>
+              <w:t>Verdict</w:t>
+            </w:r>
+          </w:p>
+        </w:tc>
+        <w:tc>
+          <w:tcPr>
+            <w:tcW w:type="dxa" w:w="5543"/>
+          </w:tcPr>
+          <w:p>
+            <w:r>
+              <w:t>Change</w:t>
+            </w:r>
+          </w:p>
+        </w:tc>
+        <w:tc>
+          <w:tcPr>
+            <w:tcW w:type="dxa" w:w="1840"/>
+          </w:tcPr>
+          <w:p>
+            <w:r>
+              <w:t>No</w:t>
+            </w:r>
+          </w:p>
+        </w:tc>
+      </w:tr>
+      <w:tr>
+        <w:tc>
+          <w:tcPr>
+            <w:tcW w:type="dxa" w:w="1847"/>
+          </w:tcPr>
+          <w:p>
+            <w:r>
+              <w:t>3</w:t>
+            </w:r>
+          </w:p>
+        </w:tc>
+        <w:tc>
+          <w:tcPr>
+            <w:tcW w:type="dxa" w:w="2617"/>
+          </w:tcPr>
+          <w:p>
+            <w:r>
+              <w:t>Prometheus `/metrics` endpoint on `sensor-collector` (REQ-WMS-004).</w:t>
+            </w:r>
+          </w:p>
+        </w:tc>
+        <w:tc>
+          <w:tcPr>
+            <w:tcW w:type="dxa" w:w="2462"/>
+          </w:tcPr>
+          <w:p>
+            <w:r>
+              <w:t>Verdict</w:t>
+            </w:r>
+          </w:p>
+        </w:tc>
+        <w:tc>
+          <w:tcPr>
+            <w:tcW w:type="dxa" w:w="5543"/>
+          </w:tcPr>
+          <w:p>
+            <w:r>
+              <w:t>Change</w:t>
+            </w:r>
+          </w:p>
+        </w:tc>
+        <w:tc>
+          <w:tcPr>
+            <w:tcW w:type="dxa" w:w="1840"/>
+          </w:tcPr>
+          <w:p>
+            <w:r>
+              <w:t>No</w:t>
+            </w:r>
+          </w:p>
+        </w:tc>
+      </w:tr>
+      <w:tr>
+        <w:tc>
+          <w:tcPr>
+            <w:tcW w:type="dxa" w:w="1847"/>
+          </w:tcPr>
+          <w:p>
+            <w:r>
+              <w:t>4</w:t>
+            </w:r>
+          </w:p>
+        </w:tc>
+        <w:tc>
+          <w:tcPr>
+            <w:tcW w:type="dxa" w:w="2617"/>
+          </w:tcPr>
+          <w:p>
+            <w:r>
+              <w:t>Graceful shutdown drain (REQ-WMS-025).</w:t>
+            </w:r>
+          </w:p>
+        </w:tc>
+        <w:tc>
+          <w:tcPr>
+            <w:tcW w:type="dxa" w:w="2462"/>
+          </w:tcPr>
+          <w:p>
+            <w:r>
+              <w:t>Verdict</w:t>
+            </w:r>
+          </w:p>
+        </w:tc>
+        <w:tc>
+          <w:tcPr>
+            <w:tcW w:type="dxa" w:w="5543"/>
+          </w:tcPr>
+          <w:p>
+            <w:r>
+              <w:t>Change</w:t>
+            </w:r>
+          </w:p>
+        </w:tc>
+        <w:tc>
+          <w:tcPr>
+            <w:tcW w:type="dxa" w:w="1840"/>
+          </w:tcPr>
+          <w:p>
+            <w:r>
+              <w:t>No</w:t>
+            </w:r>
+          </w:p>
+        </w:tc>
+      </w:tr>
     </w:tbl>
     <w:p>
       <w:pPr>
@@ -26588,7 +28202,11 @@
             </w:tcBorders>
             <w:vAlign w:val="bottom"/>
           </w:tcPr>
-          <w:p/>
+          <w:p>
+            <w:r>
+              <w:t>- **Backward Compatibility**: `alert-dispatcher` 1.2.0 is NOT backward compatible with `anomaly-engine` 2.0.x payloads; incorrect deployment order will cause event rejection.</w:t>
+            </w:r>
+          </w:p>
         </w:tc>
         <w:tc>
           <w:tcPr>
@@ -26601,13 +28219,9 @@
             </w:tcBorders>
           </w:tcPr>
           <w:p>
-            <w:pPr>
-              <w:spacing w:after="0"/>
-              <w:jc w:val="center"/>
-              <w:rPr>
-                <w:i/>
-              </w:rPr>
-            </w:pPr>
+            <w:r>
+              <w:t>auto-generated</w:t>
+            </w:r>
           </w:p>
         </w:tc>
       </w:tr>
@@ -26654,7 +28268,11 @@
             </w:tcBorders>
             <w:vAlign w:val="bottom"/>
           </w:tcPr>
-          <w:p/>
+          <w:p>
+            <w:r>
+              <w:t>- **Operational**: The `confidence` field is not yet surfaced in the ops dashboard (accessible via syslog only).</w:t>
+            </w:r>
+          </w:p>
         </w:tc>
         <w:tc>
           <w:tcPr>
@@ -26667,13 +28285,9 @@
             </w:tcBorders>
           </w:tcPr>
           <w:p>
-            <w:pPr>
-              <w:spacing w:after="0"/>
-              <w:jc w:val="center"/>
-              <w:rPr>
-                <w:i/>
-              </w:rPr>
-            </w:pPr>
+            <w:r>
+              <w:t>auto-generated</w:t>
+            </w:r>
           </w:p>
         </w:tc>
       </w:tr>
@@ -26720,7 +28334,11 @@
             </w:tcBorders>
             <w:vAlign w:val="bottom"/>
           </w:tcPr>
-          <w:p/>
+          <w:p>
+            <w:r>
+              <w:t>- **Documentation**: Operator runbooks for the DEGRADED alert tier are currently in draft.</w:t>
+            </w:r>
+          </w:p>
         </w:tc>
         <w:tc>
           <w:tcPr>
@@ -26733,13 +28351,9 @@
             </w:tcBorders>
           </w:tcPr>
           <w:p>
-            <w:pPr>
-              <w:spacing w:after="0"/>
-              <w:jc w:val="center"/>
-              <w:rPr>
-                <w:i/>
-              </w:rPr>
-            </w:pPr>
+            <w:r>
+              <w:t>auto-generated</w:t>
+            </w:r>
           </w:p>
         </w:tc>
       </w:tr>
@@ -26767,6 +28381,21 @@
       </w:r>
       <w:bookmarkEnd w:id="988"/>
       <w:bookmarkEnd w:id="989"/>
+    </w:p>
+    <w:p>
+      <w:r>
+        <w:t xml:space="preserve">_Evidence not available in this release bundle._</w:t>
+      </w:r>
+    </w:p>
+    <w:p>
+      <w:r>
+        <w:t xml:space="preserve">---</w:t>
+      </w:r>
+    </w:p>
+    <w:p>
+      <w:r>
+        <w:t xml:space="preserve">_Auto-drafted by Verdict on release `v0.4`._</w:t>
+      </w:r>
     </w:p>
     <w:p>
       <w:pPr>

</xml_diff>